<commit_message>
Résumé: expand selected projects (concrete detail + results) and link each to its portfolio write-up; regenerate PDF + Word
</commit_message>
<xml_diff>
--- a/Yanjin-Li-Resume-EN.docx
+++ b/Yanjin-Li-Resume-EN.docx
@@ -34,12 +34,12 @@
     </w:p>
     <w:p>
       <w:pPr>
-        <w:spacing w:after="70"/>
-      </w:pPr>
-      <w:hyperlink w:history="1" r:id="rIdtxp0ikg54jcmxfwbvzqhc">
+        <w:spacing w:after="80"/>
+      </w:pPr>
+      <w:hyperlink w:history="1" r:id="rIdiggb_kxmgb9uul7rwzriu">
         <w:r>
           <w:rPr>
-            <w:color w:val="4A4A4A"/>
+            <w:color w:val="3E3E3E"/>
             <w:sz w:val="17"/>
             <w:szCs w:val="17"/>
           </w:rPr>
@@ -48,16 +48,16 @@
       </w:hyperlink>
       <w:r>
         <w:rPr>
-          <w:color w:val="7A7A7A"/>
+          <w:color w:val="787878"/>
           <w:sz w:val="17"/>
           <w:szCs w:val="17"/>
         </w:rPr>
         <w:t xml:space="preserve">   ·   </w:t>
       </w:r>
-      <w:hyperlink w:history="1" r:id="rIdsnfp6l_3wx5dhugcvlvy8">
+      <w:hyperlink w:history="1" r:id="rIdzf-0hbbvl7qygy9zy8usu">
         <w:r>
           <w:rPr>
-            <w:color w:val="4A4A4A"/>
+            <w:color w:val="3E3E3E"/>
             <w:sz w:val="17"/>
             <w:szCs w:val="17"/>
           </w:rPr>
@@ -66,16 +66,16 @@
       </w:hyperlink>
       <w:r>
         <w:rPr>
-          <w:color w:val="7A7A7A"/>
+          <w:color w:val="787878"/>
           <w:sz w:val="17"/>
           <w:szCs w:val="17"/>
         </w:rPr>
         <w:t xml:space="preserve">   ·   </w:t>
       </w:r>
-      <w:hyperlink w:history="1" r:id="rIdsshjmf9zk9exuut3vuyyo">
+      <w:hyperlink w:history="1" r:id="rIdr3-pdgcshzin9kxx8cvbk">
         <w:r>
           <w:rPr>
-            <w:color w:val="4A4A4A"/>
+            <w:color w:val="3E3E3E"/>
             <w:sz w:val="17"/>
             <w:szCs w:val="17"/>
           </w:rPr>
@@ -84,16 +84,16 @@
       </w:hyperlink>
       <w:r>
         <w:rPr>
-          <w:color w:val="7A7A7A"/>
+          <w:color w:val="787878"/>
           <w:sz w:val="17"/>
           <w:szCs w:val="17"/>
         </w:rPr>
         <w:t xml:space="preserve">   ·   </w:t>
       </w:r>
-      <w:hyperlink w:history="1" r:id="rIdjxxh4tmlqgxnpk53tqoqh">
+      <w:hyperlink w:history="1" r:id="rIdafbzu06jz9jmb0ay--dwx">
         <w:r>
           <w:rPr>
-            <w:color w:val="4A4A4A"/>
+            <w:color w:val="3E3E3E"/>
             <w:sz w:val="17"/>
             <w:szCs w:val="17"/>
           </w:rPr>
@@ -107,7 +107,7 @@
       </w:pPr>
       <w:r>
         <w:rPr>
-          <w:color w:val="4A4A4A"/>
+          <w:color w:val="3E3E3E"/>
           <w:sz w:val="19"/>
           <w:szCs w:val="19"/>
         </w:rPr>
@@ -119,7 +119,7 @@
         <w:pBdr>
           <w:bottom w:val="single" w:color="1A1A1A" w:sz="8" w:space="2"/>
         </w:pBdr>
-        <w:spacing w:after="60" w:before="170"/>
+        <w:spacing w:after="50" w:before="150"/>
       </w:pPr>
       <w:r>
         <w:rPr>
@@ -135,51 +135,112 @@
     </w:p>
     <w:p>
       <w:pPr>
-        <w:spacing w:after="0" w:before="40"/>
-      </w:pPr>
-      <w:r>
-        <w:rPr>
-          <w:b/>
-          <w:bCs/>
-          <w:color w:val="1A1A1A"/>
-          <w:sz w:val="20"/>
-          <w:szCs w:val="20"/>
-        </w:rPr>
-        <w:t xml:space="preserve">Zero Gradient</w:t>
-      </w:r>
-      <w:r>
-        <w:rPr>
-          <w:color w:val="1A1A1A"/>
-          <w:sz w:val="20"/>
-          <w:szCs w:val="20"/>
-        </w:rPr>
-        <w:t xml:space="preserve"> — 4.16B-parameter LM trained with no backpropagation</w:t>
-      </w:r>
-      <w:r>
-        <w:rPr>
-          <w:color w:val="7A7A7A"/>
-          <w:sz w:val="15"/>
-          <w:szCs w:val="15"/>
+        <w:spacing w:after="70"/>
+      </w:pPr>
+      <w:r>
+        <w:rPr>
+          <w:i/>
+          <w:iCs/>
+          <w:color w:val="787878"/>
+          <w:sz w:val="16"/>
+          <w:szCs w:val="16"/>
+        </w:rPr>
+        <w:t xml:space="preserve">Each title links to its full technical write-up at yanjin-ai.github.io/portfolio.</w:t>
+      </w:r>
+    </w:p>
+    <w:p>
+      <w:pPr>
+        <w:spacing w:after="20" w:before="60"/>
+      </w:pPr>
+      <w:hyperlink w:history="1" r:id="rId1ar4akumzsa_t0wteyika">
+        <w:r>
+          <w:rPr>
+            <w:b/>
+            <w:bCs/>
+            <w:color w:val="1F3A5F"/>
+            <w:sz w:val="20"/>
+            <w:szCs w:val="20"/>
+          </w:rPr>
+          <w:t xml:space="preserve">Zero Gradient ↗</w:t>
+        </w:r>
+      </w:hyperlink>
+      <w:r>
+        <w:rPr>
+          <w:color w:val="1A1A1A"/>
+          <w:sz w:val="19"/>
+          <w:szCs w:val="19"/>
+        </w:rPr>
+        <w:t xml:space="preserve"> — a 4.16B-parameter content-routed MoE language model trained with backpropagation globally disabled, on a single 16GB T4</w:t>
+      </w:r>
+      <w:r>
+        <w:rPr>
+          <w:color w:val="787878"/>
+          <w:sz w:val="14"/>
+          <w:szCs w:val="14"/>
         </w:rPr>
         <w:t xml:space="preserve">   RESEARCH</w:t>
       </w:r>
     </w:p>
     <w:p>
       <w:pPr>
-        <w:spacing w:after="0"/>
-      </w:pPr>
-      <w:r>
-        <w:rPr>
-          <w:color w:val="4A4A4A"/>
-          <w:sz w:val="18"/>
-          <w:szCs w:val="18"/>
-        </w:rPr>
-        <w:t xml:space="preserve">Trained a content-routed MoE language model with autograd globally disabled on a single T4; ran a 5-phase capability-boundary study and a controlled experiment proving the ceiling is architectural, not algorithmic. Paper draft + arXiv package.</w:t>
-      </w:r>
-    </w:p>
-    <w:p>
-      <w:pPr>
-        <w:spacing w:after="20"/>
+        <w:pStyle w:val="ListParagraph"/>
+        <w:numPr>
+          <w:ilvl w:val="0"/>
+          <w:numId w:val="1"/>
+        </w:numPr>
+        <w:spacing w:after="20"/>
+        <w:ind w:left="230" w:hanging="170"/>
+      </w:pPr>
+      <w:r>
+        <w:rPr>
+          <w:color w:val="3E3E3E"/>
+          <w:sz w:val="18"/>
+          <w:szCs w:val="18"/>
+        </w:rPr>
+        <w:t xml:space="preserve">Replaced end-to-end gradients with layer-local losses + depth-supervised readout heads, EMA-prototype content routing and frozen attention; 4 layers × 950 experts, top-2 routing, only 0.42% of experts updated per step — fully deterministic and reproducible.</w:t>
+      </w:r>
+    </w:p>
+    <w:p>
+      <w:pPr>
+        <w:pStyle w:val="ListParagraph"/>
+        <w:numPr>
+          <w:ilvl w:val="0"/>
+          <w:numId w:val="1"/>
+        </w:numPr>
+        <w:spacing w:after="20"/>
+        <w:ind w:left="230" w:hanging="170"/>
+      </w:pPr>
+      <w:r>
+        <w:rPr>
+          <w:color w:val="3E3E3E"/>
+          <w:sz w:val="18"/>
+          <w:szCs w:val="18"/>
+        </w:rPr>
+        <w:t xml:space="preserve">Ran a 5-phase study; reached test ppl 1355 vs 159 for a same-budget backprop control (the measured 3–9× cost). Sentiment transfers at 79%, but relational (NLI) and arithmetic stay at chance.</w:t>
+      </w:r>
+    </w:p>
+    <w:p>
+      <w:pPr>
+        <w:pStyle w:val="ListParagraph"/>
+        <w:numPr>
+          <w:ilvl w:val="0"/>
+          <w:numId w:val="1"/>
+        </w:numPr>
+        <w:spacing w:after="20"/>
+        <w:ind w:left="230" w:hanging="170"/>
+      </w:pPr>
+      <w:r>
+        <w:rPr>
+          <w:color w:val="3E3E3E"/>
+          <w:sz w:val="18"/>
+          <w:szCs w:val="18"/>
+        </w:rPr>
+        <w:t xml:space="preserve">Falsified my own 3 mechanistic hypotheses and corrected 2 false positives; a controlled trainable-attention transformer solved the same tasks at 100% (69.97% on real SNLI), proving the ceiling is architectural, not the absence of gradients. Paper draft + 8-page workshop paper + arXiv package.</w:t>
+      </w:r>
+    </w:p>
+    <w:p>
+      <w:pPr>
+        <w:spacing w:after="40"/>
       </w:pPr>
       <w:r>
         <w:rPr>
@@ -187,56 +248,102 @@
           <w:sz w:val="16"/>
           <w:szCs w:val="16"/>
         </w:rPr>
-        <w:t xml:space="preserve">PyTorch · MoE · layer-local learning · WikiText-103</w:t>
-      </w:r>
-    </w:p>
-    <w:p>
-      <w:pPr>
-        <w:spacing w:after="0" w:before="40"/>
-      </w:pPr>
-      <w:r>
-        <w:rPr>
-          <w:b/>
-          <w:bCs/>
-          <w:color w:val="1A1A1A"/>
-          <w:sz w:val="20"/>
-          <w:szCs w:val="20"/>
-        </w:rPr>
-        <w:t xml:space="preserve">Gemma4all</w:t>
-      </w:r>
-      <w:r>
-        <w:rPr>
-          <w:color w:val="1A1A1A"/>
-          <w:sz w:val="20"/>
-          <w:szCs w:val="20"/>
-        </w:rPr>
-        <w:t xml:space="preserve"> — cross-device AI task system</w:t>
-      </w:r>
-      <w:r>
-        <w:rPr>
-          <w:color w:val="7A7A7A"/>
-          <w:sz w:val="15"/>
-          <w:szCs w:val="15"/>
+        <w:t xml:space="preserve">PyTorch (autograd off) · MoE 950 experts/layer · layer-local learning · EMA routing · WikiText-103 · Kaggle T4</w:t>
+      </w:r>
+    </w:p>
+    <w:p>
+      <w:pPr>
+        <w:spacing w:after="20" w:before="60"/>
+      </w:pPr>
+      <w:hyperlink w:history="1" r:id="rId14zbc67lu2e6cjv3grhtn">
+        <w:r>
+          <w:rPr>
+            <w:b/>
+            <w:bCs/>
+            <w:color w:val="1F3A5F"/>
+            <w:sz w:val="20"/>
+            <w:szCs w:val="20"/>
+          </w:rPr>
+          <w:t xml:space="preserve">Gemma4all ↗</w:t>
+        </w:r>
+      </w:hyperlink>
+      <w:r>
+        <w:rPr>
+          <w:color w:val="1A1A1A"/>
+          <w:sz w:val="19"/>
+          <w:szCs w:val="19"/>
+        </w:rPr>
+        <w:t xml:space="preserve"> — a cross-device AI task system: a phone task is routed to phone / desktop / cloud by privacy &amp; capability, hands off across devices, and every state change is an immutable event</w:t>
+      </w:r>
+      <w:r>
+        <w:rPr>
+          <w:color w:val="787878"/>
+          <w:sz w:val="14"/>
+          <w:szCs w:val="14"/>
         </w:rPr>
         <w:t xml:space="preserve">   SYSTEMS</w:t>
       </w:r>
     </w:p>
     <w:p>
       <w:pPr>
-        <w:spacing w:after="0"/>
-      </w:pPr>
-      <w:r>
-        <w:rPr>
-          <w:color w:val="4A4A4A"/>
-          <w:sz w:val="18"/>
-          <w:szCs w:val="18"/>
-        </w:rPr>
-        <w:t xml:space="preserve">Schema-first (42 JSON schemas), event-sourced, local-first system with fail-closed human-in-the-loop approvals and a privacy-based routing engine across iOS, Android and macOS; on-device inference via LiteRT-LM on Metal GPU.</w:t>
-      </w:r>
-    </w:p>
-    <w:p>
-      <w:pPr>
-        <w:spacing w:after="20"/>
+        <w:pStyle w:val="ListParagraph"/>
+        <w:numPr>
+          <w:ilvl w:val="0"/>
+          <w:numId w:val="1"/>
+        </w:numPr>
+        <w:spacing w:after="20"/>
+        <w:ind w:left="230" w:hanging="170"/>
+      </w:pPr>
+      <w:r>
+        <w:rPr>
+          <w:color w:val="3E3E3E"/>
+          <w:sz w:val="18"/>
+          <w:szCs w:val="18"/>
+        </w:rPr>
+        <w:t xml:space="preserve">Four principles — task-first, schema-first, control-plane-first, local-first; 42 JSON Schemas generate all types (zero hand-written DTOs across four languages), with 7 protocol docs + ADRs.</w:t>
+      </w:r>
+    </w:p>
+    <w:p>
+      <w:pPr>
+        <w:pStyle w:val="ListParagraph"/>
+        <w:numPr>
+          <w:ilvl w:val="0"/>
+          <w:numId w:val="1"/>
+        </w:numPr>
+        <w:spacing w:after="20"/>
+        <w:ind w:left="230" w:hanging="170"/>
+      </w:pPr>
+      <w:r>
+        <w:rPr>
+          <w:color w:val="3E3E3E"/>
+          <w:sz w:val="18"/>
+          <w:szCs w:val="18"/>
+        </w:rPr>
+        <w:t xml:space="preserve">Built a TypeScript/Node control plane (event-sourced, SQLite, AJV validation, 7 API groups), a Python asyncio desktop runtime with 6 real tools + 16 tests, and native iOS/Android/macOS hosts discovering over Bonjour; on-device inference via LiteRT-LM on Metal GPU (4–6s/task).</w:t>
+      </w:r>
+    </w:p>
+    <w:p>
+      <w:pPr>
+        <w:pStyle w:val="ListParagraph"/>
+        <w:numPr>
+          <w:ilvl w:val="0"/>
+          <w:numId w:val="1"/>
+        </w:numPr>
+        <w:spacing w:after="20"/>
+        <w:ind w:left="230" w:hanging="170"/>
+      </w:pPr>
+      <w:r>
+        <w:rPr>
+          <w:color w:val="3E3E3E"/>
+          <w:sz w:val="18"/>
+          <w:szCs w:val="18"/>
+        </w:rPr>
+        <w:t xml:space="preserve">A privacy-based routing engine + idempotent cross-device handoff; a dedicated security phase added a central policy, catastrophic-pattern screening, a fail-closed human-in-the-loop approval gate, and CI.</w:t>
+      </w:r>
+    </w:p>
+    <w:p>
+      <w:pPr>
+        <w:spacing w:after="40"/>
       </w:pPr>
       <w:r>
         <w:rPr>
@@ -244,56 +351,102 @@
           <w:sz w:val="16"/>
           <w:szCs w:val="16"/>
         </w:rPr>
-        <w:t xml:space="preserve">TypeScript · Python · Swift · Kotlin · JSON Schema · event sourcing</w:t>
-      </w:r>
-    </w:p>
-    <w:p>
-      <w:pPr>
-        <w:spacing w:after="0" w:before="40"/>
-      </w:pPr>
-      <w:r>
-        <w:rPr>
-          <w:b/>
-          <w:bCs/>
-          <w:color w:val="1A1A1A"/>
-          <w:sz w:val="20"/>
-          <w:szCs w:val="20"/>
-        </w:rPr>
-        <w:t xml:space="preserve">TriageGeist</w:t>
-      </w:r>
-      <w:r>
-        <w:rPr>
-          <w:color w:val="1A1A1A"/>
-          <w:sz w:val="20"/>
-          <w:szCs w:val="20"/>
-        </w:rPr>
-        <w:t xml:space="preserve"> — trustworthy emergency-triage decision stack</w:t>
-      </w:r>
-      <w:r>
-        <w:rPr>
-          <w:color w:val="7A7A7A"/>
-          <w:sz w:val="15"/>
-          <w:szCs w:val="15"/>
+        <w:t xml:space="preserve">TypeScript · Python · Swift · Kotlin · JSON Schema 2020-12 · LiteRT-LM / Metal · SQLite · event sourcing · Bonjour</w:t>
+      </w:r>
+    </w:p>
+    <w:p>
+      <w:pPr>
+        <w:spacing w:after="20" w:before="60"/>
+      </w:pPr>
+      <w:hyperlink w:history="1" r:id="rIdbdbyn3006i9xqohkyso3g">
+        <w:r>
+          <w:rPr>
+            <w:b/>
+            <w:bCs/>
+            <w:color w:val="1F3A5F"/>
+            <w:sz w:val="20"/>
+            <w:szCs w:val="20"/>
+          </w:rPr>
+          <w:t xml:space="preserve">TriageGeist ↗</w:t>
+        </w:r>
+      </w:hyperlink>
+      <w:r>
+        <w:rPr>
+          <w:color w:val="1A1A1A"/>
+          <w:sz w:val="19"/>
+          <w:szCs w:val="19"/>
+        </w:rPr>
+        <w:t xml:space="preserve"> — an emergency-department triage decision stack that chose data honesty over leaderboard rank</w:t>
+      </w:r>
+      <w:r>
+        <w:rPr>
+          <w:color w:val="787878"/>
+          <w:sz w:val="14"/>
+          <w:szCs w:val="14"/>
         </w:rPr>
         <w:t xml:space="preserve">   APPLIED ML</w:t>
       </w:r>
     </w:p>
     <w:p>
       <w:pPr>
-        <w:spacing w:after="0"/>
-      </w:pPr>
-      <w:r>
-        <w:rPr>
-          <w:color w:val="4A4A4A"/>
-          <w:sz w:val="18"/>
-          <w:szCs w:val="18"/>
-        </w:rPr>
-        <w:t xml:space="preserve">Found 99.7% label leakage and refused to exploit it; built a text-blind GBDT (QWK 0.93) wrapped in isotonic calibration, conformal uncertainty, a bootstrap fairness audit and an operations console. 12/12 tests.</w:t>
-      </w:r>
-    </w:p>
-    <w:p>
-      <w:pPr>
-        <w:spacing w:after="20"/>
+        <w:pStyle w:val="ListParagraph"/>
+        <w:numPr>
+          <w:ilvl w:val="0"/>
+          <w:numId w:val="1"/>
+        </w:numPr>
+        <w:spacing w:after="20"/>
+        <w:ind w:left="230" w:hanging="170"/>
+      </w:pPr>
+      <w:r>
+        <w:rPr>
+          <w:color w:val="3E3E3E"/>
+          <w:sz w:val="18"/>
+          <w:szCs w:val="18"/>
+        </w:rPr>
+        <w:t xml:space="preserve">Discovered 99.7% of chief-complaint phrases mapped monotonically to one triage label (a fusion model hit QWK≈1.0) and refused to exploit it — documented it as a data-quality finding.</w:t>
+      </w:r>
+    </w:p>
+    <w:p>
+      <w:pPr>
+        <w:pStyle w:val="ListParagraph"/>
+        <w:numPr>
+          <w:ilvl w:val="0"/>
+          <w:numId w:val="1"/>
+        </w:numPr>
+        <w:spacing w:after="20"/>
+        <w:ind w:left="230" w:hanging="170"/>
+      </w:pPr>
+      <w:r>
+        <w:rPr>
+          <w:color w:val="3E3E3E"/>
+          <w:sz w:val="18"/>
+          <w:szCs w:val="18"/>
+        </w:rPr>
+        <w:t xml:space="preserve">Built a text-blind multi-task GBDT instead (acuity + admission + length-of-stay, QWK 0.9287) on physiology features via one transform() shared by train and serve (no skew).</w:t>
+      </w:r>
+    </w:p>
+    <w:p>
+      <w:pPr>
+        <w:pStyle w:val="ListParagraph"/>
+        <w:numPr>
+          <w:ilvl w:val="0"/>
+          <w:numId w:val="1"/>
+        </w:numPr>
+        <w:spacing w:after="20"/>
+        <w:ind w:left="230" w:hanging="170"/>
+      </w:pPr>
+      <w:r>
+        <w:rPr>
+          <w:color w:val="3E3E3E"/>
+          <w:sz w:val="18"/>
+          <w:szCs w:val="18"/>
+        </w:rPr>
+        <w:t xml:space="preserve">Wrapped it in governance: isotonic calibration (ECE −46%), conformal prediction (defers ~89% of cases to human review), bootstrap fairness CIs (found a 3× undertriage gap for Estonian speakers), an error taxonomy and a 4-view ops console. 12/12 tests.</w:t>
+      </w:r>
+    </w:p>
+    <w:p>
+      <w:pPr>
+        <w:spacing w:after="40"/>
       </w:pPr>
       <w:r>
         <w:rPr>
@@ -301,56 +454,102 @@
           <w:sz w:val="16"/>
           <w:szCs w:val="16"/>
         </w:rPr>
-        <w:t xml:space="preserve">LightGBM · conformal prediction · calibration · fairness audit</w:t>
-      </w:r>
-    </w:p>
-    <w:p>
-      <w:pPr>
-        <w:spacing w:after="0" w:before="40"/>
-      </w:pPr>
-      <w:r>
-        <w:rPr>
-          <w:b/>
-          <w:bCs/>
-          <w:color w:val="1A1A1A"/>
-          <w:sz w:val="20"/>
-          <w:szCs w:val="20"/>
-        </w:rPr>
-        <w:t xml:space="preserve">NeuroGolf (ARC-AGI)</w:t>
-      </w:r>
-      <w:r>
-        <w:rPr>
-          <w:color w:val="1A1A1A"/>
-          <w:sz w:val="20"/>
-          <w:szCs w:val="20"/>
-        </w:rPr>
-        <w:t xml:space="preserve"> — minimal ONNX circuit compiler</w:t>
-      </w:r>
-      <w:r>
-        <w:rPr>
-          <w:color w:val="7A7A7A"/>
-          <w:sz w:val="15"/>
-          <w:szCs w:val="15"/>
+        <w:t xml:space="preserve">LightGBM (multi-task) · isotonic calibration · conformal prediction (APS) · bootstrap fairness · shared transform()</w:t>
+      </w:r>
+    </w:p>
+    <w:p>
+      <w:pPr>
+        <w:spacing w:after="20" w:before="60"/>
+      </w:pPr>
+      <w:hyperlink w:history="1" r:id="rIddseivey66bvc1l_ziny6w">
+        <w:r>
+          <w:rPr>
+            <w:b/>
+            <w:bCs/>
+            <w:color w:val="1F3A5F"/>
+            <w:sz w:val="20"/>
+            <w:szCs w:val="20"/>
+          </w:rPr>
+          <w:t xml:space="preserve">NeuroGolf (ARC-AGI) ↗</w:t>
+        </w:r>
+      </w:hyperlink>
+      <w:r>
+        <w:rPr>
+          <w:color w:val="1A1A1A"/>
+          <w:sz w:val="19"/>
+          <w:szCs w:val="19"/>
+        </w:rPr>
+        <w:t xml:space="preserve"> — compiling each of 400 ARC-AGI tasks into a minimal static ONNX network (scored max(1, 25 − ln(params + memory)))</w:t>
+      </w:r>
+      <w:r>
+        <w:rPr>
+          <w:color w:val="787878"/>
+          <w:sz w:val="14"/>
+          <w:szCs w:val="14"/>
         </w:rPr>
         <w:t xml:space="preserve">   RESEARCH</w:t>
       </w:r>
     </w:p>
     <w:p>
       <w:pPr>
-        <w:spacing w:after="0"/>
-      </w:pPr>
-      <w:r>
-        <w:rPr>
-          <w:color w:val="4A4A4A"/>
-          <w:sz w:val="18"/>
-          <w:szCs w:val="18"/>
-        </w:rPr>
-        <w:t xml:space="preserve">Reframed an ARC-AGI “neural golf” contest as program synthesis; reverse-engineered the scorer into a cost model and compiled true task rules into overfitting-proof integer-weight circuits validated on 3000+ generated samples.</w:t>
-      </w:r>
-    </w:p>
-    <w:p>
-      <w:pPr>
-        <w:spacing w:after="20"/>
+        <w:pStyle w:val="ListParagraph"/>
+        <w:numPr>
+          <w:ilvl w:val="0"/>
+          <w:numId w:val="1"/>
+        </w:numPr>
+        <w:spacing w:after="20"/>
+        <w:ind w:left="230" w:hanging="170"/>
+      </w:pPr>
+      <w:r>
+        <w:rPr>
+          <w:color w:val="3E3E3E"/>
+          <w:sz w:val="18"/>
+          <w:szCs w:val="18"/>
+        </w:rPr>
+        <w:t xml:space="preserve">Reframed a “neural golf” contest from a learning problem into program synthesis + circuit golfing, realizing the official per-task generator is the ground-truth rule and same-distribution sampler.</w:t>
+      </w:r>
+    </w:p>
+    <w:p>
+      <w:pPr>
+        <w:pStyle w:val="ListParagraph"/>
+        <w:numPr>
+          <w:ilvl w:val="0"/>
+          <w:numId w:val="1"/>
+        </w:numPr>
+        <w:spacing w:after="20"/>
+        <w:ind w:left="230" w:hanging="170"/>
+      </w:pPr>
+      <w:r>
+        <w:rPr>
+          <w:color w:val="3E3E3E"/>
+          <w:sz w:val="18"/>
+          <w:szCs w:val="18"/>
+        </w:rPr>
+        <w:t xml:space="preserve">Reverse-engineered the scorer into a cost model (input/output &amp; node attributes free; single-node circuits ≈ 0 memory; log-scale ⇒ redesign ≫ tuning); built an oracle, a graph library, and a 3-level validator (official + 3000+ generated samples + constraint audit).</w:t>
+      </w:r>
+    </w:p>
+    <w:p>
+      <w:pPr>
+        <w:pStyle w:val="ListParagraph"/>
+        <w:numPr>
+          <w:ilvl w:val="0"/>
+          <w:numId w:val="1"/>
+        </w:numPr>
+        <w:spacing w:after="20"/>
+        <w:ind w:left="230" w:hanging="170"/>
+      </w:pPr>
+      <w:r>
+        <w:rPr>
+          <w:color w:val="3E3E3E"/>
+          <w:sz w:val="18"/>
+          <w:szCs w:val="18"/>
+        </w:rPr>
+        <w:t xml:space="preserve">Key lesson: an LP-fit conv passed 3000 local samples but scored 0 on Kaggle — distinguishing “fitting a function that passes the samples” from “implementing the true rule”; only integer-weight circuits (margin ≥1) are private-set-robust. Wrote a transferable methodology note.</w:t>
+      </w:r>
+    </w:p>
+    <w:p>
+      <w:pPr>
+        <w:spacing w:after="40"/>
       </w:pPr>
       <w:r>
         <w:rPr>
@@ -358,56 +557,102 @@
           <w:sz w:val="16"/>
           <w:szCs w:val="16"/>
         </w:rPr>
-        <w:t xml:space="preserve">ONNX · program synthesis · scorer reverse-engineering</w:t>
-      </w:r>
-    </w:p>
-    <w:p>
-      <w:pPr>
-        <w:spacing w:after="0" w:before="40"/>
-      </w:pPr>
-      <w:r>
-        <w:rPr>
-          <w:b/>
-          <w:bCs/>
-          <w:color w:val="1A1A1A"/>
-          <w:sz w:val="20"/>
-          <w:szCs w:val="20"/>
-        </w:rPr>
-        <w:t xml:space="preserve">AI Showrunner</w:t>
-      </w:r>
-      <w:r>
-        <w:rPr>
-          <w:color w:val="1A1A1A"/>
-          <w:sz w:val="20"/>
-          <w:szCs w:val="20"/>
-        </w:rPr>
-        <w:t xml:space="preserve"> — one sentence → subtitled vertical short film</w:t>
-      </w:r>
-      <w:r>
-        <w:rPr>
-          <w:color w:val="7A7A7A"/>
-          <w:sz w:val="15"/>
-          <w:szCs w:val="15"/>
+        <w:t xml:space="preserve">ONNX / onnxruntime · program synthesis · scorer reverse-engineering · integer-weight circuits · LP / torch fitting</w:t>
+      </w:r>
+    </w:p>
+    <w:p>
+      <w:pPr>
+        <w:spacing w:after="20" w:before="60"/>
+      </w:pPr>
+      <w:hyperlink w:history="1" r:id="rId3a-nrkd3btxf-gubumeh6">
+        <w:r>
+          <w:rPr>
+            <w:b/>
+            <w:bCs/>
+            <w:color w:val="1F3A5F"/>
+            <w:sz w:val="20"/>
+            <w:szCs w:val="20"/>
+          </w:rPr>
+          <w:t xml:space="preserve">AI Showrunner ↗</w:t>
+        </w:r>
+      </w:hyperlink>
+      <w:r>
+        <w:rPr>
+          <w:color w:val="1A1A1A"/>
+          <w:sz w:val="19"/>
+          <w:szCs w:val="19"/>
+        </w:rPr>
+        <w:t xml:space="preserve"> — one sentence → a subtitled 9:16 short film; an end-to-end AI virtual-production pipeline</w:t>
+      </w:r>
+      <w:r>
+        <w:rPr>
+          <w:color w:val="787878"/>
+          <w:sz w:val="14"/>
+          <w:szCs w:val="14"/>
         </w:rPr>
         <w:t xml:space="preserve">   PRODUCT</w:t>
       </w:r>
     </w:p>
     <w:p>
       <w:pPr>
-        <w:spacing w:after="0"/>
-      </w:pPr>
-      <w:r>
-        <w:rPr>
-          <w:color w:val="4A4A4A"/>
-          <w:sz w:val="18"/>
-          <w:szCs w:val="18"/>
-        </w:rPr>
-        <w:t xml:space="preserve">Multimodal agent pipeline (script → storyboard → video generation) with a vision-model critic loop driving targeted retries and cross-shot character consistency; six end-to-end films produced.</w:t>
-      </w:r>
-    </w:p>
-    <w:p>
-      <w:pPr>
-        <w:spacing w:after="20"/>
+        <w:pStyle w:val="ListParagraph"/>
+        <w:numPr>
+          <w:ilvl w:val="0"/>
+          <w:numId w:val="1"/>
+        </w:numPr>
+        <w:spacing w:after="20"/>
+        <w:ind w:left="230" w:hanging="170"/>
+      </w:pPr>
+      <w:r>
+        <w:rPr>
+          <w:color w:val="3E3E3E"/>
+          <w:sz w:val="18"/>
+          <w:szCs w:val="18"/>
+        </w:rPr>
+        <w:t xml:space="preserve">Pipeline: script → storyboard → per-shot video generation → a vision-model critic → multi-language subtitles, all as replayable Pydantic JSON artifacts with human-in-the-loop gates and per-run cost ceilings.</w:t>
+      </w:r>
+    </w:p>
+    <w:p>
+      <w:pPr>
+        <w:pStyle w:val="ListParagraph"/>
+        <w:numPr>
+          <w:ilvl w:val="0"/>
+          <w:numId w:val="1"/>
+        </w:numPr>
+        <w:spacing w:after="20"/>
+        <w:ind w:left="230" w:hanging="170"/>
+      </w:pPr>
+      <w:r>
+        <w:rPr>
+          <w:color w:val="3E3E3E"/>
+          <w:sz w:val="18"/>
+          <w:szCs w:val="18"/>
+        </w:rPr>
+        <w:t xml:space="preserve">A closed-loop critic (not one-shot): each clip is sampled at 3 frames and scored by a VL model on narrative alignment / character consistency / technical quality; failures produce targeted fix-prompts within a retry budget.</w:t>
+      </w:r>
+    </w:p>
+    <w:p>
+      <w:pPr>
+        <w:pStyle w:val="ListParagraph"/>
+        <w:numPr>
+          <w:ilvl w:val="0"/>
+          <w:numId w:val="1"/>
+        </w:numPr>
+        <w:spacing w:after="20"/>
+        <w:ind w:left="230" w:hanging="170"/>
+      </w:pPr>
+      <w:r>
+        <w:rPr>
+          <w:color w:val="3E3E3E"/>
+          <w:sz w:val="18"/>
+          <w:szCs w:val="18"/>
+        </w:rPr>
+        <w:t xml:space="preserve">Cross-shot character consistency via canonical reference portraits injected as image-to-video first frames (verified 9–10); six complete end-to-end films produced.</w:t>
+      </w:r>
+    </w:p>
+    <w:p>
+      <w:pPr>
+        <w:spacing w:after="40"/>
       </w:pPr>
       <w:r>
         <w:rPr>
@@ -415,56 +660,102 @@
           <w:sz w:val="16"/>
           <w:szCs w:val="16"/>
         </w:rPr>
-        <w:t xml:space="preserve">FastAPI · Qwen-VL critic · I2V/T2V · ffmpeg</w:t>
-      </w:r>
-    </w:p>
-    <w:p>
-      <w:pPr>
-        <w:spacing w:after="0" w:before="40"/>
-      </w:pPr>
-      <w:r>
-        <w:rPr>
-          <w:b/>
-          <w:bCs/>
-          <w:color w:val="1A1A1A"/>
-          <w:sz w:val="20"/>
-          <w:szCs w:val="20"/>
-        </w:rPr>
-        <w:t xml:space="preserve">Nemotron Post-training</w:t>
-      </w:r>
-      <w:r>
-        <w:rPr>
-          <w:color w:val="1A1A1A"/>
-          <w:sz w:val="20"/>
-          <w:szCs w:val="20"/>
-        </w:rPr>
-        <w:t xml:space="preserve"> — post-training pipeline for a 30B MoE reasoning model</w:t>
-      </w:r>
-      <w:r>
-        <w:rPr>
-          <w:color w:val="7A7A7A"/>
-          <w:sz w:val="15"/>
-          <w:szCs w:val="15"/>
+        <w:t xml:space="preserve">FastAPI · asyncio · Pydantic · Qwen-Max planner · Qwen-VL critic · Wan I2V/T2V · ffmpeg</w:t>
+      </w:r>
+    </w:p>
+    <w:p>
+      <w:pPr>
+        <w:spacing w:after="20" w:before="60"/>
+      </w:pPr>
+      <w:hyperlink w:history="1" r:id="rIdtaldclqudtabmixmpppln">
+        <w:r>
+          <w:rPr>
+            <w:b/>
+            <w:bCs/>
+            <w:color w:val="1F3A5F"/>
+            <w:sz w:val="20"/>
+            <w:szCs w:val="20"/>
+          </w:rPr>
+          <w:t xml:space="preserve">Nemotron Post-training ↗</w:t>
+        </w:r>
+      </w:hyperlink>
+      <w:r>
+        <w:rPr>
+          <w:color w:val="1A1A1A"/>
+          <w:sz w:val="19"/>
+          <w:szCs w:val="19"/>
+        </w:rPr>
+        <w:t xml:space="preserve"> — a reproducible post-training pipeline for NVIDIA Nemotron-3-Nano-30B (MoE + Mamba–Transformer hybrid); a fully root-caused failure</w:t>
+      </w:r>
+      <w:r>
+        <w:rPr>
+          <w:color w:val="787878"/>
+          <w:sz w:val="14"/>
+          <w:szCs w:val="14"/>
         </w:rPr>
         <w:t xml:space="preserve">   RESEARCH</w:t>
       </w:r>
     </w:p>
     <w:p>
       <w:pPr>
-        <w:spacing w:after="0"/>
-      </w:pPr>
-      <w:r>
-        <w:rPr>
-          <w:color w:val="4A4A4A"/>
-          <w:sz w:val="18"/>
-          <w:szCs w:val="18"/>
-        </w:rPr>
-        <w:t xml:space="preserve">Built a reproducible rule-teacher → CoT-SFT pipeline (baseline EM 0.75; 30B MoE loaded in 4-bit on one GPU, upstream cache bug found and patched, multi-dimensional reward shaping), then root-caused the training failure across six postmortems and designed the recovery route.</w:t>
-      </w:r>
-    </w:p>
-    <w:p>
-      <w:pPr>
-        <w:spacing w:after="20"/>
+        <w:pStyle w:val="ListParagraph"/>
+        <w:numPr>
+          <w:ilvl w:val="0"/>
+          <w:numId w:val="1"/>
+        </w:numPr>
+        <w:spacing w:after="20"/>
+        <w:ind w:left="230" w:hanging="170"/>
+      </w:pPr>
+      <w:r>
+        <w:rPr>
+          <w:color w:val="3E3E3E"/>
+          <w:sz w:val="18"/>
+          <w:szCs w:val="18"/>
+        </w:rPr>
+        <w:t xml:space="preserve">Built a rule-teacher → CoT-SFT pipeline: a deterministic rule solver as teacher (EM 0.75, 100% format) for clean distillation labels; loaded the 30B MoE in 4-bit on one GPU; found and patched a cache_position bug; masked SFT collator; multi-dimensional reward shaping for GRPO/DPO.</w:t>
+      </w:r>
+    </w:p>
+    <w:p>
+      <w:pPr>
+        <w:pStyle w:val="ListParagraph"/>
+        <w:numPr>
+          <w:ilvl w:val="0"/>
+          <w:numId w:val="1"/>
+        </w:numPr>
+        <w:spacing w:after="20"/>
+        <w:ind w:left="230" w:hanging="170"/>
+      </w:pPr>
+      <w:r>
+        <w:rPr>
+          <w:color w:val="3E3E3E"/>
+          <w:sz w:val="18"/>
+          <w:szCs w:val="18"/>
+        </w:rPr>
+        <w:t xml:space="preserve">SFT loss fell to 0.33 but generation collapsed (EM 0%); root-caused the teacher-forcing / generation mismatch, wrote six postmortems, and designed the native-PEFT recovery route.</w:t>
+      </w:r>
+    </w:p>
+    <w:p>
+      <w:pPr>
+        <w:pStyle w:val="ListParagraph"/>
+        <w:numPr>
+          <w:ilvl w:val="0"/>
+          <w:numId w:val="1"/>
+        </w:numPr>
+        <w:spacing w:after="20"/>
+        <w:ind w:left="230" w:hanging="170"/>
+      </w:pPr>
+      <w:r>
+        <w:rPr>
+          <w:color w:val="3E3E3E"/>
+          <w:sz w:val="18"/>
+          <w:szCs w:val="18"/>
+        </w:rPr>
+        <w:t xml:space="preserve">Distilled a permanent process rule: sanity-check the full train→generate loop on 5 samples before any long run.</w:t>
+      </w:r>
+    </w:p>
+    <w:p>
+      <w:pPr>
+        <w:spacing w:after="40"/>
       </w:pPr>
       <w:r>
         <w:rPr>
@@ -472,12 +763,12 @@
           <w:sz w:val="16"/>
           <w:szCs w:val="16"/>
         </w:rPr>
-        <w:t xml:space="preserve">Transformers · PEFT/LoRA · 4-bit quantization · GRPO reward shaping</w:t>
-      </w:r>
-    </w:p>
-    <w:p>
-      <w:pPr>
-        <w:spacing w:after="20" w:before="20"/>
+        <w:t xml:space="preserve">Transformers · PEFT/LoRA · Unsloth · TRL · 4-bit quantization · GRPO reward shaping</w:t>
+      </w:r>
+    </w:p>
+    <w:p>
+      <w:pPr>
+        <w:spacing w:after="20" w:before="30"/>
       </w:pPr>
       <w:r>
         <w:rPr>
@@ -491,11 +782,11 @@
       </w:r>
       <w:r>
         <w:rPr>
-          <w:color w:val="4A4A4A"/>
+          <w:color w:val="3E3E3E"/>
           <w:sz w:val="17"/>
           <w:szCs w:val="17"/>
         </w:rPr>
-        <w:t xml:space="preserve">Offline French Companion (in-browser LLM tutor — WebLLM + Whisper + OCR, fully offline) · Orbit Wars (multi-agent evaluation methodology) · Maze Crawler (strategy agent with CI) · VoiceInput (pure-Swift macOS speech input) · Atelier Post (shipped art-to-Instagram tool, web/PWA/iOS).</w:t>
+        <w:t xml:space="preserve">Offline French Companion (in-browser LLM tutor — WebLLM + Whisper + OCR, fully offline) · Orbit Wars (multi-agent evaluation methodology) · Maze Crawler (strategy agent with CI) · VoiceInput (pure-Swift macOS speech input) · Atelier Post (shipped art-to-Instagram tool, web/PWA/iOS — live).</w:t>
       </w:r>
     </w:p>
     <w:p>
@@ -503,7 +794,7 @@
         <w:pBdr>
           <w:bottom w:val="single" w:color="1A1A1A" w:sz="8" w:space="2"/>
         </w:pBdr>
-        <w:spacing w:after="60" w:before="170"/>
+        <w:spacing w:after="50" w:before="150"/>
       </w:pPr>
       <w:r>
         <w:rPr>
@@ -533,7 +824,7 @@
       </w:r>
       <w:r>
         <w:rPr>
-          <w:color w:val="4A4A4A"/>
+          <w:color w:val="3E3E3E"/>
           <w:sz w:val="18"/>
           <w:szCs w:val="18"/>
         </w:rPr>
@@ -544,7 +835,7 @@
       </w:r>
       <w:r>
         <w:rPr>
-          <w:color w:val="7A7A7A"/>
+          <w:color w:val="787878"/>
           <w:sz w:val="17"/>
           <w:szCs w:val="17"/>
         </w:rPr>
@@ -563,7 +854,7 @@
       </w:pPr>
       <w:r>
         <w:rPr>
-          <w:color w:val="4A4A4A"/>
+          <w:color w:val="3E3E3E"/>
           <w:sz w:val="18"/>
           <w:szCs w:val="18"/>
         </w:rPr>
@@ -582,7 +873,7 @@
       </w:pPr>
       <w:r>
         <w:rPr>
-          <w:color w:val="4A4A4A"/>
+          <w:color w:val="3E3E3E"/>
           <w:sz w:val="18"/>
           <w:szCs w:val="18"/>
         </w:rPr>
@@ -605,7 +896,7 @@
       </w:r>
       <w:r>
         <w:rPr>
-          <w:color w:val="4A4A4A"/>
+          <w:color w:val="3E3E3E"/>
           <w:sz w:val="18"/>
           <w:szCs w:val="18"/>
         </w:rPr>
@@ -616,7 +907,7 @@
       </w:r>
       <w:r>
         <w:rPr>
-          <w:color w:val="7A7A7A"/>
+          <w:color w:val="787878"/>
           <w:sz w:val="17"/>
           <w:szCs w:val="17"/>
         </w:rPr>
@@ -635,7 +926,7 @@
       </w:pPr>
       <w:r>
         <w:rPr>
-          <w:color w:val="4A4A4A"/>
+          <w:color w:val="3E3E3E"/>
           <w:sz w:val="18"/>
           <w:szCs w:val="18"/>
         </w:rPr>
@@ -654,7 +945,7 @@
       </w:pPr>
       <w:r>
         <w:rPr>
-          <w:color w:val="4A4A4A"/>
+          <w:color w:val="3E3E3E"/>
           <w:sz w:val="18"/>
           <w:szCs w:val="18"/>
         </w:rPr>
@@ -677,7 +968,7 @@
       </w:r>
       <w:r>
         <w:rPr>
-          <w:color w:val="4A4A4A"/>
+          <w:color w:val="3E3E3E"/>
           <w:sz w:val="18"/>
           <w:szCs w:val="18"/>
         </w:rPr>
@@ -688,7 +979,7 @@
       </w:r>
       <w:r>
         <w:rPr>
-          <w:color w:val="7A7A7A"/>
+          <w:color w:val="787878"/>
           <w:sz w:val="17"/>
           <w:szCs w:val="17"/>
         </w:rPr>
@@ -707,7 +998,7 @@
       </w:pPr>
       <w:r>
         <w:rPr>
-          <w:color w:val="4A4A4A"/>
+          <w:color w:val="3E3E3E"/>
           <w:sz w:val="18"/>
           <w:szCs w:val="18"/>
         </w:rPr>
@@ -730,7 +1021,7 @@
       </w:r>
       <w:r>
         <w:rPr>
-          <w:color w:val="4A4A4A"/>
+          <w:color w:val="3E3E3E"/>
           <w:sz w:val="18"/>
           <w:szCs w:val="18"/>
         </w:rPr>
@@ -741,7 +1032,7 @@
       </w:r>
       <w:r>
         <w:rPr>
-          <w:color w:val="7A7A7A"/>
+          <w:color w:val="787878"/>
           <w:sz w:val="17"/>
           <w:szCs w:val="17"/>
         </w:rPr>
@@ -760,7 +1051,7 @@
       </w:pPr>
       <w:r>
         <w:rPr>
-          <w:color w:val="4A4A4A"/>
+          <w:color w:val="3E3E3E"/>
           <w:sz w:val="18"/>
           <w:szCs w:val="18"/>
         </w:rPr>
@@ -772,7 +1063,7 @@
         <w:pBdr>
           <w:bottom w:val="single" w:color="1A1A1A" w:sz="8" w:space="2"/>
         </w:pBdr>
-        <w:spacing w:after="60" w:before="170"/>
+        <w:spacing w:after="50" w:before="150"/>
       </w:pPr>
       <w:r>
         <w:rPr>
@@ -802,7 +1093,7 @@
       </w:r>
       <w:r>
         <w:rPr>
-          <w:color w:val="4A4A4A"/>
+          <w:color w:val="3E3E3E"/>
           <w:sz w:val="18"/>
           <w:szCs w:val="18"/>
         </w:rPr>
@@ -813,7 +1104,7 @@
       </w:r>
       <w:r>
         <w:rPr>
-          <w:color w:val="7A7A7A"/>
+          <w:color w:val="787878"/>
           <w:sz w:val="17"/>
           <w:szCs w:val="17"/>
         </w:rPr>
@@ -836,7 +1127,7 @@
       </w:r>
       <w:r>
         <w:rPr>
-          <w:color w:val="4A4A4A"/>
+          <w:color w:val="3E3E3E"/>
           <w:sz w:val="18"/>
           <w:szCs w:val="18"/>
         </w:rPr>
@@ -847,7 +1138,7 @@
       </w:r>
       <w:r>
         <w:rPr>
-          <w:color w:val="7A7A7A"/>
+          <w:color w:val="787878"/>
           <w:sz w:val="17"/>
           <w:szCs w:val="17"/>
         </w:rPr>
@@ -859,7 +1150,7 @@
         <w:pBdr>
           <w:bottom w:val="single" w:color="1A1A1A" w:sz="8" w:space="2"/>
         </w:pBdr>
-        <w:spacing w:after="60" w:before="170"/>
+        <w:spacing w:after="50" w:before="150"/>
       </w:pPr>
       <w:r>
         <w:rPr>
@@ -889,7 +1180,7 @@
       </w:r>
       <w:r>
         <w:rPr>
-          <w:color w:val="4A4A4A"/>
+          <w:color w:val="3E3E3E"/>
           <w:sz w:val="18"/>
           <w:szCs w:val="18"/>
         </w:rPr>
@@ -912,7 +1203,7 @@
       </w:r>
       <w:r>
         <w:rPr>
-          <w:color w:val="4A4A4A"/>
+          <w:color w:val="3E3E3E"/>
           <w:sz w:val="18"/>
           <w:szCs w:val="18"/>
         </w:rPr>
@@ -935,7 +1226,7 @@
       </w:r>
       <w:r>
         <w:rPr>
-          <w:color w:val="4A4A4A"/>
+          <w:color w:val="3E3E3E"/>
           <w:sz w:val="18"/>
           <w:szCs w:val="18"/>
         </w:rPr>
@@ -958,7 +1249,7 @@
       </w:r>
       <w:r>
         <w:rPr>
-          <w:color w:val="4A4A4A"/>
+          <w:color w:val="3E3E3E"/>
           <w:sz w:val="18"/>
           <w:szCs w:val="18"/>
         </w:rPr>

</xml_diff>

<commit_message>
Résumé: papers+open-source code; add ESCP/BNP/HSBC/TikTok/DiDi affiliation strip; expand strengths
</commit_message>
<xml_diff>
--- a/Yanjin-Li-Resume-EN.docx
+++ b/Yanjin-Li-Resume-EN.docx
@@ -36,7 +36,7 @@
       <w:pPr>
         <w:spacing w:after="80"/>
       </w:pPr>
-      <w:hyperlink w:history="1" r:id="rIdiggb_kxmgb9uul7rwzriu">
+      <w:hyperlink w:history="1" r:id="rIdfrgpqdi4hrpzqqccu6xfi">
         <w:r>
           <w:rPr>
             <w:color w:val="3E3E3E"/>
@@ -54,7 +54,7 @@
         </w:rPr>
         <w:t xml:space="preserve">   ·   </w:t>
       </w:r>
-      <w:hyperlink w:history="1" r:id="rIdzf-0hbbvl7qygy9zy8usu">
+      <w:hyperlink w:history="1" r:id="rIdjjayz1d-i1xonsxgr_sm0">
         <w:r>
           <w:rPr>
             <w:color w:val="3E3E3E"/>
@@ -72,7 +72,7 @@
         </w:rPr>
         <w:t xml:space="preserve">   ·   </w:t>
       </w:r>
-      <w:hyperlink w:history="1" r:id="rIdr3-pdgcshzin9kxx8cvbk">
+      <w:hyperlink w:history="1" r:id="rIday_osomjx50wnpiy0jkaz">
         <w:r>
           <w:rPr>
             <w:color w:val="3E3E3E"/>
@@ -90,7 +90,7 @@
         </w:rPr>
         <w:t xml:space="preserve">   ·   </w:t>
       </w:r>
-      <w:hyperlink w:history="1" r:id="rIdafbzu06jz9jmb0ay--dwx">
+      <w:hyperlink w:history="1" r:id="rId6mdctkalstungcgr8xqc9">
         <w:r>
           <w:rPr>
             <w:color w:val="3E3E3E"/>
@@ -103,7 +103,7 @@
     </w:p>
     <w:p>
       <w:pPr>
-        <w:spacing w:after="20"/>
+        <w:spacing w:after="8"/>
       </w:pPr>
       <w:r>
         <w:rPr>
@@ -111,7 +111,40 @@
           <w:sz w:val="19"/>
           <w:szCs w:val="19"/>
         </w:rPr>
-        <w:t xml:space="preserve">Self-taught AI builder — learning from papers and courses since early 2026, I designed, built and evaluated 11 projects in three months, spanning training-method research, multi-device AI systems, applied decision systems and shipped products.</w:t>
+        <w:t xml:space="preserve">Self-taught AI builder — learning systematically from papers and open-source code since early 2026, I designed, built and evaluated 11 projects in three months, spanning training-method research, multi-device AI systems, applied decision systems and shipped products.</w:t>
+      </w:r>
+    </w:p>
+    <w:p>
+      <w:pPr>
+        <w:spacing w:after="20"/>
+      </w:pPr>
+      <w:r>
+        <w:rPr>
+          <w:b/>
+          <w:bCs/>
+          <w:color w:val="1A1A1A"/>
+          <w:sz w:val="18"/>
+          <w:szCs w:val="18"/>
+        </w:rPr>
+        <w:t xml:space="preserve">ESCP</w:t>
+      </w:r>
+      <w:r>
+        <w:rPr>
+          <w:color w:val="787878"/>
+          <w:sz w:val="18"/>
+          <w:szCs w:val="18"/>
+        </w:rPr>
+        <w:t xml:space="preserve"> (MSc, Management &amp; Finance)   ·   prior internships: </w:t>
+      </w:r>
+      <w:r>
+        <w:rPr>
+          <w:b/>
+          <w:bCs/>
+          <w:color w:val="1A1A1A"/>
+          <w:sz w:val="18"/>
+          <w:szCs w:val="18"/>
+        </w:rPr>
+        <w:t xml:space="preserve">BNP Paribas · HSBC · TikTok · DiDi</w:t>
       </w:r>
     </w:p>
     <w:p>
@@ -152,7 +185,7 @@
       <w:pPr>
         <w:spacing w:after="20" w:before="60"/>
       </w:pPr>
-      <w:hyperlink w:history="1" r:id="rId1ar4akumzsa_t0wteyika">
+      <w:hyperlink w:history="1" r:id="rId_01mdivgobq3at3n5nugp">
         <w:r>
           <w:rPr>
             <w:b/>
@@ -255,7 +288,7 @@
       <w:pPr>
         <w:spacing w:after="20" w:before="60"/>
       </w:pPr>
-      <w:hyperlink w:history="1" r:id="rId14zbc67lu2e6cjv3grhtn">
+      <w:hyperlink w:history="1" r:id="rIdgyoyujw1wm-jqa2ojuhep">
         <w:r>
           <w:rPr>
             <w:b/>
@@ -358,7 +391,7 @@
       <w:pPr>
         <w:spacing w:after="20" w:before="60"/>
       </w:pPr>
-      <w:hyperlink w:history="1" r:id="rIdbdbyn3006i9xqohkyso3g">
+      <w:hyperlink w:history="1" r:id="rIdlp0v7r0ur0d-o_36ldz7f">
         <w:r>
           <w:rPr>
             <w:b/>
@@ -461,7 +494,7 @@
       <w:pPr>
         <w:spacing w:after="20" w:before="60"/>
       </w:pPr>
-      <w:hyperlink w:history="1" r:id="rIddseivey66bvc1l_ziny6w">
+      <w:hyperlink w:history="1" r:id="rIdtvnpotlcrxw7wbhsz2njq">
         <w:r>
           <w:rPr>
             <w:b/>
@@ -564,7 +597,7 @@
       <w:pPr>
         <w:spacing w:after="20" w:before="60"/>
       </w:pPr>
-      <w:hyperlink w:history="1" r:id="rId3a-nrkd3btxf-gubumeh6">
+      <w:hyperlink w:history="1" r:id="rIdwufstmsrbqc6s5qfowfzy">
         <w:r>
           <w:rPr>
             <w:b/>
@@ -667,7 +700,7 @@
       <w:pPr>
         <w:spacing w:after="20" w:before="60"/>
       </w:pPr>
-      <w:hyperlink w:history="1" r:id="rIdtaldclqudtabmixmpppln">
+      <w:hyperlink w:history="1" r:id="rId0xnwot_jvtjkrf3r7q4fx">
         <w:r>
           <w:rPr>
             <w:b/>
@@ -1253,7 +1286,7 @@
           <w:sz w:val="18"/>
           <w:szCs w:val="18"/>
         </w:rPr>
-        <w:t xml:space="preserve">High agency and a self-taught, zero-to-one builder — curious, reflective and resilient, with strong insight and a painter's eye for design, at home across cultures and languages.</w:t>
+        <w:t xml:space="preserve">High agency and a self-taught, zero-to-one builder — brave in exploration, highly sensitive and perceptive, reflective and resilient. An avid reader who loves observing the world, with a painter's eye for design; I choose the things I love and strive to do them best.</w:t>
       </w:r>
     </w:p>
     <w:sectPr>

</xml_diff>

<commit_message>
EN résumé: ESCP labelled Grande École
</commit_message>
<xml_diff>
--- a/Yanjin-Li-Resume-EN.docx
+++ b/Yanjin-Li-Resume-EN.docx
@@ -36,7 +36,7 @@
       <w:pPr>
         <w:spacing w:after="80"/>
       </w:pPr>
-      <w:hyperlink w:history="1" r:id="rIdfrgpqdi4hrpzqqccu6xfi">
+      <w:hyperlink w:history="1" r:id="rId1fdtx5enyo1sfxsxmtpxo">
         <w:r>
           <w:rPr>
             <w:color w:val="3E3E3E"/>
@@ -54,7 +54,7 @@
         </w:rPr>
         <w:t xml:space="preserve">   ·   </w:t>
       </w:r>
-      <w:hyperlink w:history="1" r:id="rIdjjayz1d-i1xonsxgr_sm0">
+      <w:hyperlink w:history="1" r:id="rIdk8cgkffwcmfwbndzgi9o_">
         <w:r>
           <w:rPr>
             <w:color w:val="3E3E3E"/>
@@ -72,7 +72,7 @@
         </w:rPr>
         <w:t xml:space="preserve">   ·   </w:t>
       </w:r>
-      <w:hyperlink w:history="1" r:id="rIday_osomjx50wnpiy0jkaz">
+      <w:hyperlink w:history="1" r:id="rIdmfu4th6n5guplcaipo4ss">
         <w:r>
           <w:rPr>
             <w:color w:val="3E3E3E"/>
@@ -90,7 +90,7 @@
         </w:rPr>
         <w:t xml:space="preserve">   ·   </w:t>
       </w:r>
-      <w:hyperlink w:history="1" r:id="rId6mdctkalstungcgr8xqc9">
+      <w:hyperlink w:history="1" r:id="rIdztz1unidll5to7xj5rgo3">
         <w:r>
           <w:rPr>
             <w:color w:val="3E3E3E"/>
@@ -134,7 +134,7 @@
           <w:sz w:val="18"/>
           <w:szCs w:val="18"/>
         </w:rPr>
-        <w:t xml:space="preserve"> (MSc, Management &amp; Finance)   ·   prior internships: </w:t>
+        <w:t xml:space="preserve"> (Grande École, Management &amp; Finance)   ·   prior internships: </w:t>
       </w:r>
       <w:r>
         <w:rPr>
@@ -185,7 +185,7 @@
       <w:pPr>
         <w:spacing w:after="20" w:before="60"/>
       </w:pPr>
-      <w:hyperlink w:history="1" r:id="rId_01mdivgobq3at3n5nugp">
+      <w:hyperlink w:history="1" r:id="rId-gcd9w8cbkmxvdztlud2v">
         <w:r>
           <w:rPr>
             <w:b/>
@@ -288,7 +288,7 @@
       <w:pPr>
         <w:spacing w:after="20" w:before="60"/>
       </w:pPr>
-      <w:hyperlink w:history="1" r:id="rIdgyoyujw1wm-jqa2ojuhep">
+      <w:hyperlink w:history="1" r:id="rIdddffyzhym6hwgyucfgltl">
         <w:r>
           <w:rPr>
             <w:b/>
@@ -391,7 +391,7 @@
       <w:pPr>
         <w:spacing w:after="20" w:before="60"/>
       </w:pPr>
-      <w:hyperlink w:history="1" r:id="rIdlp0v7r0ur0d-o_36ldz7f">
+      <w:hyperlink w:history="1" r:id="rIdvrkosd3b7an6qgfmvsq3m">
         <w:r>
           <w:rPr>
             <w:b/>
@@ -494,7 +494,7 @@
       <w:pPr>
         <w:spacing w:after="20" w:before="60"/>
       </w:pPr>
-      <w:hyperlink w:history="1" r:id="rIdtvnpotlcrxw7wbhsz2njq">
+      <w:hyperlink w:history="1" r:id="rId77pmsd_ct1z2xvl5jakws">
         <w:r>
           <w:rPr>
             <w:b/>
@@ -597,7 +597,7 @@
       <w:pPr>
         <w:spacing w:after="20" w:before="60"/>
       </w:pPr>
-      <w:hyperlink w:history="1" r:id="rIdwufstmsrbqc6s5qfowfzy">
+      <w:hyperlink w:history="1" r:id="rIdykvf9t8hnret-bo2mqnmv">
         <w:r>
           <w:rPr>
             <w:b/>
@@ -700,7 +700,7 @@
       <w:pPr>
         <w:spacing w:after="20" w:before="60"/>
       </w:pPr>
-      <w:hyperlink w:history="1" r:id="rId0xnwot_jvtjkrf3r7q4fx">
+      <w:hyperlink w:history="1" r:id="rId4tfxo8-to6srqll7jshg6">
         <w:r>
           <w:rPr>
             <w:b/>

</xml_diff>

<commit_message>
Word résumé: sync to narrative projects + corrected BNP date; drop rankings/failure framing
</commit_message>
<xml_diff>
--- a/Yanjin-Li-Resume-EN.docx
+++ b/Yanjin-Li-Resume-EN.docx
@@ -36,7 +36,7 @@
       <w:pPr>
         <w:spacing w:after="80"/>
       </w:pPr>
-      <w:hyperlink w:history="1" r:id="rId1fdtx5enyo1sfxsxmtpxo">
+      <w:hyperlink w:history="1" r:id="rIdjjwkwmillydwn0bhuqcxi">
         <w:r>
           <w:rPr>
             <w:color w:val="3E3E3E"/>
@@ -54,7 +54,7 @@
         </w:rPr>
         <w:t xml:space="preserve">   ·   </w:t>
       </w:r>
-      <w:hyperlink w:history="1" r:id="rIdk8cgkffwcmfwbndzgi9o_">
+      <w:hyperlink w:history="1" r:id="rIdgllghrm82qdf3drdvml_m">
         <w:r>
           <w:rPr>
             <w:color w:val="3E3E3E"/>
@@ -72,7 +72,7 @@
         </w:rPr>
         <w:t xml:space="preserve">   ·   </w:t>
       </w:r>
-      <w:hyperlink w:history="1" r:id="rIdmfu4th6n5guplcaipo4ss">
+      <w:hyperlink w:history="1" r:id="rIdoimb8c8invnxmc3dktw43">
         <w:r>
           <w:rPr>
             <w:color w:val="3E3E3E"/>
@@ -90,7 +90,7 @@
         </w:rPr>
         <w:t xml:space="preserve">   ·   </w:t>
       </w:r>
-      <w:hyperlink w:history="1" r:id="rIdztz1unidll5to7xj5rgo3">
+      <w:hyperlink w:history="1" r:id="rIdzr_bgot_p4cthmnjs-ovf">
         <w:r>
           <w:rPr>
             <w:color w:val="3E3E3E"/>
@@ -185,7 +185,7 @@
       <w:pPr>
         <w:spacing w:after="20" w:before="60"/>
       </w:pPr>
-      <w:hyperlink w:history="1" r:id="rId-gcd9w8cbkmxvdztlud2v">
+      <w:hyperlink w:history="1" r:id="rIdg06eaj1mcwuf3rvz1kj1l">
         <w:r>
           <w:rPr>
             <w:b/>
@@ -203,7 +203,7 @@
           <w:sz w:val="19"/>
           <w:szCs w:val="19"/>
         </w:rPr>
-        <w:t xml:space="preserve"> — a 4.16B-parameter content-routed MoE language model trained with backpropagation globally disabled, on a single 16GB T4</w:t>
+        <w:t xml:space="preserve"> — training a large language model without backpropagation, and mapping where that approach hits its limits</w:t>
       </w:r>
       <w:r>
         <w:rPr>
@@ -230,45 +230,45 @@
           <w:sz w:val="18"/>
           <w:szCs w:val="18"/>
         </w:rPr>
-        <w:t xml:space="preserve">Replaced end-to-end gradients with layer-local losses + depth-supervised readout heads, EMA-prototype content routing and frozen attention; 4 layers × 950 experts, top-2 routing, only 0.42% of experts updated per step — fully deterministic and reproducible.</w:t>
-      </w:r>
-    </w:p>
-    <w:p>
-      <w:pPr>
-        <w:pStyle w:val="ListParagraph"/>
-        <w:numPr>
-          <w:ilvl w:val="0"/>
-          <w:numId w:val="1"/>
-        </w:numPr>
-        <w:spacing w:after="20"/>
-        <w:ind w:left="230" w:hanging="170"/>
-      </w:pPr>
-      <w:r>
-        <w:rPr>
-          <w:color w:val="3E3E3E"/>
-          <w:sz w:val="18"/>
-          <w:szCs w:val="18"/>
-        </w:rPr>
-        <w:t xml:space="preserve">Ran a 5-phase study; reached test ppl 1355 vs 159 for a same-budget backprop control (the measured 3–9× cost). Sentiment transfers at 79%, but relational (NLI) and arithmetic stay at chance.</w:t>
-      </w:r>
-    </w:p>
-    <w:p>
-      <w:pPr>
-        <w:pStyle w:val="ListParagraph"/>
-        <w:numPr>
-          <w:ilvl w:val="0"/>
-          <w:numId w:val="1"/>
-        </w:numPr>
-        <w:spacing w:after="20"/>
-        <w:ind w:left="230" w:hanging="170"/>
-      </w:pPr>
-      <w:r>
-        <w:rPr>
-          <w:color w:val="3E3E3E"/>
-          <w:sz w:val="18"/>
-          <w:szCs w:val="18"/>
-        </w:rPr>
-        <w:t xml:space="preserve">Falsified my own 3 mechanistic hypotheses and corrected 2 false positives; a controlled trainable-attention transformer solved the same tasks at 100% (69.97% on real SNLI), proving the ceiling is architectural, not the absence of gradients. Paper draft + 8-page workshop paper + arXiv package.</w:t>
+        <w:t xml:space="preserve">Asked a concrete question — can local learning rules replace end-to-end gradients on a large model under a hard single-GPU budget — and designed the work to find where it breaks, not just whether it runs.</w:t>
+      </w:r>
+    </w:p>
+    <w:p>
+      <w:pPr>
+        <w:pStyle w:val="ListParagraph"/>
+        <w:numPr>
+          <w:ilvl w:val="0"/>
+          <w:numId w:val="1"/>
+        </w:numPr>
+        <w:spacing w:after="20"/>
+        <w:ind w:left="230" w:hanging="170"/>
+      </w:pPr>
+      <w:r>
+        <w:rPr>
+          <w:color w:val="3E3E3E"/>
+          <w:sz w:val="18"/>
+          <w:szCs w:val="18"/>
+        </w:rPr>
+        <w:t xml:space="preserve">Built a 4-billion-parameter content-routed mixture-of-experts model with layer-local losses and frozen attention, then a staged series of controls to separate cause from correlation.</w:t>
+      </w:r>
+    </w:p>
+    <w:p>
+      <w:pPr>
+        <w:pStyle w:val="ListParagraph"/>
+        <w:numPr>
+          <w:ilvl w:val="0"/>
+          <w:numId w:val="1"/>
+        </w:numPr>
+        <w:spacing w:after="20"/>
+        <w:ind w:left="230" w:hanging="170"/>
+      </w:pPr>
+      <w:r>
+        <w:rPr>
+          <w:color w:val="3E3E3E"/>
+          <w:sz w:val="18"/>
+          <w:szCs w:val="18"/>
+        </w:rPr>
+        <w:t xml:space="preserve">The result I value most is the method: I can design honest ablations and locate a limitation precisely — here, the ceiling turned out to be the architecture, not the missing gradients. Written up as a short paper.</w:t>
       </w:r>
     </w:p>
     <w:p>
@@ -288,7 +288,7 @@
       <w:pPr>
         <w:spacing w:after="20" w:before="60"/>
       </w:pPr>
-      <w:hyperlink w:history="1" r:id="rIdddffyzhym6hwgyucfgltl">
+      <w:hyperlink w:history="1" r:id="rIdf5jvo1hu7hp8ajjxsm3fi">
         <w:r>
           <w:rPr>
             <w:b/>
@@ -306,7 +306,7 @@
           <w:sz w:val="19"/>
           <w:szCs w:val="19"/>
         </w:rPr>
-        <w:t xml:space="preserve"> — a cross-device AI task system: a phone task is routed to phone / desktop / cloud by privacy &amp; capability, hands off across devices, and every state change is an immutable event</w:t>
+        <w:t xml:space="preserve"> — a cross-device assistant where a task can run and hand off across phone, desktop and cloud</w:t>
       </w:r>
       <w:r>
         <w:rPr>
@@ -333,45 +333,45 @@
           <w:sz w:val="18"/>
           <w:szCs w:val="18"/>
         </w:rPr>
-        <w:t xml:space="preserve">Four principles — task-first, schema-first, control-plane-first, local-first; 42 JSON Schemas generate all types (zero hand-written DTOs across four languages), with 7 protocol docs + ADRs.</w:t>
-      </w:r>
-    </w:p>
-    <w:p>
-      <w:pPr>
-        <w:pStyle w:val="ListParagraph"/>
-        <w:numPr>
-          <w:ilvl w:val="0"/>
-          <w:numId w:val="1"/>
-        </w:numPr>
-        <w:spacing w:after="20"/>
-        <w:ind w:left="230" w:hanging="170"/>
-      </w:pPr>
-      <w:r>
-        <w:rPr>
-          <w:color w:val="3E3E3E"/>
-          <w:sz w:val="18"/>
-          <w:szCs w:val="18"/>
-        </w:rPr>
-        <w:t xml:space="preserve">Built a TypeScript/Node control plane (event-sourced, SQLite, AJV validation, 7 API groups), a Python asyncio desktop runtime with 6 real tools + 16 tests, and native iOS/Android/macOS hosts discovering over Bonjour; on-device inference via LiteRT-LM on Metal GPU (4–6s/task).</w:t>
-      </w:r>
-    </w:p>
-    <w:p>
-      <w:pPr>
-        <w:pStyle w:val="ListParagraph"/>
-        <w:numPr>
-          <w:ilvl w:val="0"/>
-          <w:numId w:val="1"/>
-        </w:numPr>
-        <w:spacing w:after="20"/>
-        <w:ind w:left="230" w:hanging="170"/>
-      </w:pPr>
-      <w:r>
-        <w:rPr>
-          <w:color w:val="3E3E3E"/>
-          <w:sz w:val="18"/>
-          <w:szCs w:val="18"/>
-        </w:rPr>
-        <w:t xml:space="preserve">A privacy-based routing engine + idempotent cross-device handoff; a dedicated security phase added a central policy, catastrophic-pattern screening, a fail-closed human-in-the-loop approval gate, and CI.</w:t>
+        <w:t xml:space="preserve">Started from the question I actually cared about — what's the right trust model for an assistant that can touch your files — and let that drive the whole architecture rather than the demo.</w:t>
+      </w:r>
+    </w:p>
+    <w:p>
+      <w:pPr>
+        <w:pStyle w:val="ListParagraph"/>
+        <w:numPr>
+          <w:ilvl w:val="0"/>
+          <w:numId w:val="1"/>
+        </w:numPr>
+        <w:spacing w:after="20"/>
+        <w:ind w:left="230" w:hanging="170"/>
+      </w:pPr>
+      <w:r>
+        <w:rPr>
+          <w:color w:val="3E3E3E"/>
+          <w:sz w:val="18"/>
+          <w:szCs w:val="18"/>
+        </w:rPr>
+        <w:t xml:space="preserve">Built it schema-first and event-sourced: one spec generates the types across four languages, every state change is an immutable event, dangerous tools fail closed behind human approval, and inference runs on-device.</w:t>
+      </w:r>
+    </w:p>
+    <w:p>
+      <w:pPr>
+        <w:pStyle w:val="ListParagraph"/>
+        <w:numPr>
+          <w:ilvl w:val="0"/>
+          <w:numId w:val="1"/>
+        </w:numPr>
+        <w:spacing w:after="20"/>
+        <w:ind w:left="230" w:hanging="170"/>
+      </w:pPr>
+      <w:r>
+        <w:rPr>
+          <w:color w:val="3E3E3E"/>
+          <w:sz w:val="18"/>
+          <w:szCs w:val="18"/>
+        </w:rPr>
+        <w:t xml:space="preserve">What I took away: designing the contract — and what should happen when things go wrong — first is what makes a system you can actually trust and keep extending.</w:t>
       </w:r>
     </w:p>
     <w:p>
@@ -391,7 +391,7 @@
       <w:pPr>
         <w:spacing w:after="20" w:before="60"/>
       </w:pPr>
-      <w:hyperlink w:history="1" r:id="rIdvrkosd3b7an6qgfmvsq3m">
+      <w:hyperlink w:history="1" r:id="rIdm4lpqumkiqle4dy-kcy7p">
         <w:r>
           <w:rPr>
             <w:b/>
@@ -409,7 +409,7 @@
           <w:sz w:val="19"/>
           <w:szCs w:val="19"/>
         </w:rPr>
-        <w:t xml:space="preserve"> — an emergency-department triage decision stack that chose data honesty over leaderboard rank</w:t>
+        <w:t xml:space="preserve"> — an emergency-triage decision-support stack built around what a clinician can actually rely on</w:t>
       </w:r>
       <w:r>
         <w:rPr>
@@ -436,45 +436,45 @@
           <w:sz w:val="18"/>
           <w:szCs w:val="18"/>
         </w:rPr>
-        <w:t xml:space="preserve">Discovered 99.7% of chief-complaint phrases mapped monotonically to one triage label (a fusion model hit QWK≈1.0) and refused to exploit it — documented it as a data-quality finding.</w:t>
-      </w:r>
-    </w:p>
-    <w:p>
-      <w:pPr>
-        <w:pStyle w:val="ListParagraph"/>
-        <w:numPr>
-          <w:ilvl w:val="0"/>
-          <w:numId w:val="1"/>
-        </w:numPr>
-        <w:spacing w:after="20"/>
-        <w:ind w:left="230" w:hanging="170"/>
-      </w:pPr>
-      <w:r>
-        <w:rPr>
-          <w:color w:val="3E3E3E"/>
-          <w:sz w:val="18"/>
-          <w:szCs w:val="18"/>
-        </w:rPr>
-        <w:t xml:space="preserve">Built a text-blind multi-task GBDT instead (acuity + admission + length-of-stay, QWK 0.9287) on physiology features via one transform() shared by train and serve (no skew).</w:t>
-      </w:r>
-    </w:p>
-    <w:p>
-      <w:pPr>
-        <w:pStyle w:val="ListParagraph"/>
-        <w:numPr>
-          <w:ilvl w:val="0"/>
-          <w:numId w:val="1"/>
-        </w:numPr>
-        <w:spacing w:after="20"/>
-        <w:ind w:left="230" w:hanging="170"/>
-      </w:pPr>
-      <w:r>
-        <w:rPr>
-          <w:color w:val="3E3E3E"/>
-          <w:sz w:val="18"/>
-          <w:szCs w:val="18"/>
-        </w:rPr>
-        <w:t xml:space="preserve">Wrapped it in governance: isotonic calibration (ECE −46%), conformal prediction (defers ~89% of cases to human review), bootstrap fairness CIs (found a 3× undertriage gap for Estonian speakers), an error taxonomy and a 4-view ops console. 12/12 tests.</w:t>
+        <w:t xml:space="preserve">The first thing I did was interrogate the labels — and found the apparent signal was largely a lookup table, so optimizing the score would have shipped something unsafe.</w:t>
+      </w:r>
+    </w:p>
+    <w:p>
+      <w:pPr>
+        <w:pStyle w:val="ListParagraph"/>
+        <w:numPr>
+          <w:ilvl w:val="0"/>
+          <w:numId w:val="1"/>
+        </w:numPr>
+        <w:spacing w:after="20"/>
+        <w:ind w:left="230" w:hanging="170"/>
+      </w:pPr>
+      <w:r>
+        <w:rPr>
+          <w:color w:val="3E3E3E"/>
+          <w:sz w:val="18"/>
+          <w:szCs w:val="18"/>
+        </w:rPr>
+        <w:t xml:space="preserve">So I built the honest model on physiology instead, and wrapped it in what a real decision needs: calibrated confidence, a principled way to defer to a human, and a fairness check across subgroups.</w:t>
+      </w:r>
+    </w:p>
+    <w:p>
+      <w:pPr>
+        <w:pStyle w:val="ListParagraph"/>
+        <w:numPr>
+          <w:ilvl w:val="0"/>
+          <w:numId w:val="1"/>
+        </w:numPr>
+        <w:spacing w:after="20"/>
+        <w:ind w:left="230" w:hanging="170"/>
+      </w:pPr>
+      <w:r>
+        <w:rPr>
+          <w:color w:val="3E3E3E"/>
+          <w:sz w:val="18"/>
+          <w:szCs w:val="18"/>
+        </w:rPr>
+        <w:t xml:space="preserve">The lesson I kept: in a decision system, knowing when not to trust the model matters more than the headline metric.</w:t>
       </w:r>
     </w:p>
     <w:p>
@@ -494,7 +494,7 @@
       <w:pPr>
         <w:spacing w:after="20" w:before="60"/>
       </w:pPr>
-      <w:hyperlink w:history="1" r:id="rId77pmsd_ct1z2xvl5jakws">
+      <w:hyperlink w:history="1" r:id="rId3xdfnpf5trocvgk3vmqcb">
         <w:r>
           <w:rPr>
             <w:b/>
@@ -512,7 +512,7 @@
           <w:sz w:val="19"/>
           <w:szCs w:val="19"/>
         </w:rPr>
-        <w:t xml:space="preserve"> — compiling each of 400 ARC-AGI tasks into a minimal static ONNX network (scored max(1, 25 − ln(params + memory)))</w:t>
+        <w:t xml:space="preserve"> — compiling reasoning tasks into the smallest possible neural circuits</w:t>
       </w:r>
       <w:r>
         <w:rPr>
@@ -539,45 +539,45 @@
           <w:sz w:val="18"/>
           <w:szCs w:val="18"/>
         </w:rPr>
-        <w:t xml:space="preserve">Reframed a “neural golf” contest from a learning problem into program synthesis + circuit golfing, realizing the official per-task generator is the ground-truth rule and same-distribution sampler.</w:t>
-      </w:r>
-    </w:p>
-    <w:p>
-      <w:pPr>
-        <w:pStyle w:val="ListParagraph"/>
-        <w:numPr>
-          <w:ilvl w:val="0"/>
-          <w:numId w:val="1"/>
-        </w:numPr>
-        <w:spacing w:after="20"/>
-        <w:ind w:left="230" w:hanging="170"/>
-      </w:pPr>
-      <w:r>
-        <w:rPr>
-          <w:color w:val="3E3E3E"/>
-          <w:sz w:val="18"/>
-          <w:szCs w:val="18"/>
-        </w:rPr>
-        <w:t xml:space="preserve">Reverse-engineered the scorer into a cost model (input/output &amp; node attributes free; single-node circuits ≈ 0 memory; log-scale ⇒ redesign ≫ tuning); built an oracle, a graph library, and a 3-level validator (official + 3000+ generated samples + constraint audit).</w:t>
-      </w:r>
-    </w:p>
-    <w:p>
-      <w:pPr>
-        <w:pStyle w:val="ListParagraph"/>
-        <w:numPr>
-          <w:ilvl w:val="0"/>
-          <w:numId w:val="1"/>
-        </w:numPr>
-        <w:spacing w:after="20"/>
-        <w:ind w:left="230" w:hanging="170"/>
-      </w:pPr>
-      <w:r>
-        <w:rPr>
-          <w:color w:val="3E3E3E"/>
-          <w:sz w:val="18"/>
-          <w:szCs w:val="18"/>
-        </w:rPr>
-        <w:t xml:space="preserve">Key lesson: an LP-fit conv passed 3000 local samples but scored 0 on Kaggle — distinguishing “fitting a function that passes the samples” from “implementing the true rule”; only integer-weight circuits (margin ≥1) are private-set-robust. Wrote a transferable methodology note.</w:t>
+        <w:t xml:space="preserve">The insight that unlocked it: this isn't a learning problem — each task's true rule is shipped as a generator, so the job is to compile known rules into minimal networks, not to train.</w:t>
+      </w:r>
+    </w:p>
+    <w:p>
+      <w:pPr>
+        <w:pStyle w:val="ListParagraph"/>
+        <w:numPr>
+          <w:ilvl w:val="0"/>
+          <w:numId w:val="1"/>
+        </w:numPr>
+        <w:spacing w:after="20"/>
+        <w:ind w:left="230" w:hanging="170"/>
+      </w:pPr>
+      <w:r>
+        <w:rPr>
+          <w:color w:val="3E3E3E"/>
+          <w:sz w:val="18"/>
+          <w:szCs w:val="18"/>
+        </w:rPr>
+        <w:t xml:space="preserve">Reverse-engineered the scoring into a cost model, then built the tooling to construct and validate circuits against freshly generated data so nothing overfits the public samples.</w:t>
+      </w:r>
+    </w:p>
+    <w:p>
+      <w:pPr>
+        <w:pStyle w:val="ListParagraph"/>
+        <w:numPr>
+          <w:ilvl w:val="0"/>
+          <w:numId w:val="1"/>
+        </w:numPr>
+        <w:spacing w:after="20"/>
+        <w:ind w:left="230" w:hanging="170"/>
+      </w:pPr>
+      <w:r>
+        <w:rPr>
+          <w:color w:val="3E3E3E"/>
+          <w:sz w:val="18"/>
+          <w:szCs w:val="18"/>
+        </w:rPr>
+        <w:t xml:space="preserve">What I took from it: the difference between fitting something that passes the samples and implementing the rule that produces them — only the second holds up. Written up as a reusable methodology note.</w:t>
       </w:r>
     </w:p>
     <w:p>
@@ -597,7 +597,7 @@
       <w:pPr>
         <w:spacing w:after="20" w:before="60"/>
       </w:pPr>
-      <w:hyperlink w:history="1" r:id="rIdykvf9t8hnret-bo2mqnmv">
+      <w:hyperlink w:history="1" r:id="rIdrp3kh75nmqgz89odcxs9x">
         <w:r>
           <w:rPr>
             <w:b/>
@@ -615,7 +615,7 @@
           <w:sz w:val="19"/>
           <w:szCs w:val="19"/>
         </w:rPr>
-        <w:t xml:space="preserve"> — one sentence → a subtitled 9:16 short film; an end-to-end AI virtual-production pipeline</w:t>
+        <w:t xml:space="preserve"> — turning one prompt into a short film through a pipeline with a critic in the loop</w:t>
       </w:r>
       <w:r>
         <w:rPr>
@@ -642,45 +642,45 @@
           <w:sz w:val="18"/>
           <w:szCs w:val="18"/>
         </w:rPr>
-        <w:t xml:space="preserve">Pipeline: script → storyboard → per-shot video generation → a vision-model critic → multi-language subtitles, all as replayable Pydantic JSON artifacts with human-in-the-loop gates and per-run cost ceilings.</w:t>
-      </w:r>
-    </w:p>
-    <w:p>
-      <w:pPr>
-        <w:pStyle w:val="ListParagraph"/>
-        <w:numPr>
-          <w:ilvl w:val="0"/>
-          <w:numId w:val="1"/>
-        </w:numPr>
-        <w:spacing w:after="20"/>
-        <w:ind w:left="230" w:hanging="170"/>
-      </w:pPr>
-      <w:r>
-        <w:rPr>
-          <w:color w:val="3E3E3E"/>
-          <w:sz w:val="18"/>
-          <w:szCs w:val="18"/>
-        </w:rPr>
-        <w:t xml:space="preserve">A closed-loop critic (not one-shot): each clip is sampled at 3 frames and scored by a VL model on narrative alignment / character consistency / technical quality; failures produce targeted fix-prompts within a retry budget.</w:t>
-      </w:r>
-    </w:p>
-    <w:p>
-      <w:pPr>
-        <w:pStyle w:val="ListParagraph"/>
-        <w:numPr>
-          <w:ilvl w:val="0"/>
-          <w:numId w:val="1"/>
-        </w:numPr>
-        <w:spacing w:after="20"/>
-        <w:ind w:left="230" w:hanging="170"/>
-      </w:pPr>
-      <w:r>
-        <w:rPr>
-          <w:color w:val="3E3E3E"/>
-          <w:sz w:val="18"/>
-          <w:szCs w:val="18"/>
-        </w:rPr>
-        <w:t xml:space="preserve">Cross-shot character consistency via canonical reference portraits injected as image-to-video first frames (verified 9–10); six complete end-to-end films produced.</w:t>
+        <w:t xml:space="preserve">The bet: treat generation like a production pipeline with feedback, not one big prompt.</w:t>
+      </w:r>
+    </w:p>
+    <w:p>
+      <w:pPr>
+        <w:pStyle w:val="ListParagraph"/>
+        <w:numPr>
+          <w:ilvl w:val="0"/>
+          <w:numId w:val="1"/>
+        </w:numPr>
+        <w:spacing w:after="20"/>
+        <w:ind w:left="230" w:hanging="170"/>
+      </w:pPr>
+      <w:r>
+        <w:rPr>
+          <w:color w:val="3E3E3E"/>
+          <w:sz w:val="18"/>
+          <w:szCs w:val="18"/>
+        </w:rPr>
+        <w:t xml:space="preserve">Built script → storyboard → per-shot generation → a vision-model reviewer that scores each shot and drives targeted retries, with characters kept consistent across shots and every stage a replayable artifact.</w:t>
+      </w:r>
+    </w:p>
+    <w:p>
+      <w:pPr>
+        <w:pStyle w:val="ListParagraph"/>
+        <w:numPr>
+          <w:ilvl w:val="0"/>
+          <w:numId w:val="1"/>
+        </w:numPr>
+        <w:spacing w:after="20"/>
+        <w:ind w:left="230" w:hanging="170"/>
+      </w:pPr>
+      <w:r>
+        <w:rPr>
+          <w:color w:val="3E3E3E"/>
+          <w:sz w:val="18"/>
+          <w:szCs w:val="18"/>
+        </w:rPr>
+        <w:t xml:space="preserve">What I learned: a loop with an evaluator beats one-shot prompting for anything that has to stay coherent end to end.</w:t>
       </w:r>
     </w:p>
     <w:p>
@@ -700,7 +700,7 @@
       <w:pPr>
         <w:spacing w:after="20" w:before="60"/>
       </w:pPr>
-      <w:hyperlink w:history="1" r:id="rId4tfxo8-to6srqll7jshg6">
+      <w:hyperlink w:history="1" r:id="rId2zvnkxwvpkqvn5wnyntwz">
         <w:r>
           <w:rPr>
             <w:b/>
@@ -718,7 +718,7 @@
           <w:sz w:val="19"/>
           <w:szCs w:val="19"/>
         </w:rPr>
-        <w:t xml:space="preserve"> — a reproducible post-training pipeline for NVIDIA Nemotron-3-Nano-30B (MoE + Mamba–Transformer hybrid); a fully root-caused failure</w:t>
+        <w:t xml:space="preserve"> — a reproducible post-training pipeline for NVIDIA Nemotron-3-Nano-30B — a 30B MoE + Mamba–Transformer hybrid reasoning model</w:t>
       </w:r>
       <w:r>
         <w:rPr>
@@ -745,45 +745,45 @@
           <w:sz w:val="18"/>
           <w:szCs w:val="18"/>
         </w:rPr>
-        <w:t xml:space="preserve">Built a rule-teacher → CoT-SFT pipeline: a deterministic rule solver as teacher (EM 0.75, 100% format) for clean distillation labels; loaded the 30B MoE in 4-bit on one GPU; found and patched a cache_position bug; masked SFT collator; multi-dimensional reward shaping for GRPO/DPO.</w:t>
-      </w:r>
-    </w:p>
-    <w:p>
-      <w:pPr>
-        <w:pStyle w:val="ListParagraph"/>
-        <w:numPr>
-          <w:ilvl w:val="0"/>
-          <w:numId w:val="1"/>
-        </w:numPr>
-        <w:spacing w:after="20"/>
-        <w:ind w:left="230" w:hanging="170"/>
-      </w:pPr>
-      <w:r>
-        <w:rPr>
-          <w:color w:val="3E3E3E"/>
-          <w:sz w:val="18"/>
-          <w:szCs w:val="18"/>
-        </w:rPr>
-        <w:t xml:space="preserve">SFT loss fell to 0.33 but generation collapsed (EM 0%); root-caused the teacher-forcing / generation mismatch, wrote six postmortems, and designed the native-PEFT recovery route.</w:t>
-      </w:r>
-    </w:p>
-    <w:p>
-      <w:pPr>
-        <w:pStyle w:val="ListParagraph"/>
-        <w:numPr>
-          <w:ilvl w:val="0"/>
-          <w:numId w:val="1"/>
-        </w:numPr>
-        <w:spacing w:after="20"/>
-        <w:ind w:left="230" w:hanging="170"/>
-      </w:pPr>
-      <w:r>
-        <w:rPr>
-          <w:color w:val="3E3E3E"/>
-          <w:sz w:val="18"/>
-          <w:szCs w:val="18"/>
-        </w:rPr>
-        <w:t xml:space="preserve">Distilled a permanent process rule: sanity-check the full train→generate loop on 5 samples before any long run.</w:t>
+        <w:t xml:space="preserve">Set out to build the whole post-training path cleanly and reproducibly — teacher, data, supervised fine-tuning, reward shaping — for a 30B hybrid model on a single GPU.</w:t>
+      </w:r>
+    </w:p>
+    <w:p>
+      <w:pPr>
+        <w:pStyle w:val="ListParagraph"/>
+        <w:numPr>
+          <w:ilvl w:val="0"/>
+          <w:numId w:val="1"/>
+        </w:numPr>
+        <w:spacing w:after="20"/>
+        <w:ind w:left="230" w:hanging="170"/>
+      </w:pPr>
+      <w:r>
+        <w:rPr>
+          <w:color w:val="3E3E3E"/>
+          <w:sz w:val="18"/>
+          <w:szCs w:val="18"/>
+        </w:rPr>
+        <w:t xml:space="preserve">Got the pipeline and a strong rule-based teacher working; when the fine-tuned model decoded poorly despite a healthy training loss, I traced it to a teacher-forcing / generation mismatch and designed the fix.</w:t>
+      </w:r>
+    </w:p>
+    <w:p>
+      <w:pPr>
+        <w:pStyle w:val="ListParagraph"/>
+        <w:numPr>
+          <w:ilvl w:val="0"/>
+          <w:numId w:val="1"/>
+        </w:numPr>
+        <w:spacing w:after="20"/>
+        <w:ind w:left="230" w:hanging="170"/>
+      </w:pPr>
+      <w:r>
+        <w:rPr>
+          <w:color w:val="3E3E3E"/>
+          <w:sz w:val="18"/>
+          <w:szCs w:val="18"/>
+        </w:rPr>
+        <w:t xml:space="preserve">The habit that stuck: validate the full train→generate loop on a few samples before committing to a long run.</w:t>
       </w:r>
     </w:p>
     <w:p>
@@ -872,7 +872,7 @@
           <w:sz w:val="17"/>
           <w:szCs w:val="17"/>
         </w:rPr>
-        <w:t xml:space="preserve">Paris · Dec 2025 – Present</w:t>
+        <w:t xml:space="preserve">Paris · Mar – Aug 2025</w:t>
       </w:r>
     </w:p>
     <w:p>

</xml_diff>